<commit_message>
Force logistic-only Part 2 and add coefficient tables
Co-authored-by: dreamcheap2000 <229635625+dreamcheap2000@users.noreply.github.com>
</commit_message>
<xml_diff>
--- a/20260909_Table1_2016.docx
+++ b/20260909_Table1_2016.docx
@@ -33,18 +33,17 @@
         <w:tblLook w:firstColumn="1" w:firstRow="1" w:lastColumn="0" w:lastRow="0" w:noHBand="0" w:noVBand="1" w:val="04A0"/>
       </w:tblPr>
       <w:tblGrid>
-        <w:gridCol w:w="1224"/>
-        <w:gridCol w:w="1224"/>
-        <w:gridCol w:w="1224"/>
-        <w:gridCol w:w="1224"/>
-        <w:gridCol w:w="1224"/>
-        <w:gridCol w:w="1224"/>
-        <w:gridCol w:w="1224"/>
-        <w:gridCol w:w="1224"/>
-        <w:gridCol w:w="1224"/>
-        <w:gridCol w:w="1224"/>
-        <w:gridCol w:w="1224"/>
-        <w:gridCol w:w="1224"/>
+        <w:gridCol w:w="1335"/>
+        <w:gridCol w:w="1335"/>
+        <w:gridCol w:w="1335"/>
+        <w:gridCol w:w="1335"/>
+        <w:gridCol w:w="1335"/>
+        <w:gridCol w:w="1335"/>
+        <w:gridCol w:w="1335"/>
+        <w:gridCol w:w="1335"/>
+        <w:gridCol w:w="1335"/>
+        <w:gridCol w:w="1335"/>
+        <w:gridCol w:w="1335"/>
       </w:tblGrid>
       <w:tr>
         <w:trPr>
@@ -52,7 +51,7 @@
         </w:trPr>
         <w:tc>
           <w:tcPr>
-            <w:tcW w:type="dxa" w:w="1224"/>
+            <w:tcW w:type="dxa" w:w="1335"/>
             <w:vAlign w:val="center"/>
           </w:tcPr>
           <w:p>
@@ -71,7 +70,7 @@
         </w:tc>
         <w:tc>
           <w:tcPr>
-            <w:tcW w:type="dxa" w:w="1224"/>
+            <w:tcW w:type="dxa" w:w="1335"/>
             <w:vAlign w:val="center"/>
           </w:tcPr>
           <w:p>
@@ -90,7 +89,7 @@
         </w:tc>
         <w:tc>
           <w:tcPr>
-            <w:tcW w:type="dxa" w:w="1224"/>
+            <w:tcW w:type="dxa" w:w="1335"/>
             <w:vAlign w:val="center"/>
           </w:tcPr>
           <w:p>
@@ -109,7 +108,7 @@
         </w:tc>
         <w:tc>
           <w:tcPr>
-            <w:tcW w:type="dxa" w:w="1224"/>
+            <w:tcW w:type="dxa" w:w="1335"/>
             <w:vAlign w:val="center"/>
           </w:tcPr>
           <w:p>
@@ -128,7 +127,7 @@
         </w:tc>
         <w:tc>
           <w:tcPr>
-            <w:tcW w:type="dxa" w:w="1224"/>
+            <w:tcW w:type="dxa" w:w="1335"/>
             <w:vAlign w:val="center"/>
           </w:tcPr>
           <w:p>
@@ -147,7 +146,7 @@
         </w:tc>
         <w:tc>
           <w:tcPr>
-            <w:tcW w:type="dxa" w:w="1224"/>
+            <w:tcW w:type="dxa" w:w="1335"/>
             <w:vAlign w:val="center"/>
           </w:tcPr>
           <w:p>
@@ -166,26 +165,7 @@
         </w:tc>
         <w:tc>
           <w:tcPr>
-            <w:tcW w:type="dxa" w:w="1224"/>
-            <w:vAlign w:val="center"/>
-          </w:tcPr>
-          <w:p>
-            <w:pPr>
-              <w:jc w:val="center"/>
-            </w:pPr>
-            <w:r>
-              <w:rPr>
-                <w:b/>
-                <w:color w:val="FFFFFF"/>
-                <w:sz w:val="14"/>
-              </w:rPr>
-              <w:t>Binary model</w:t>
-            </w:r>
-          </w:p>
-        </w:tc>
-        <w:tc>
-          <w:tcPr>
-            <w:tcW w:type="dxa" w:w="1224"/>
+            <w:tcW w:type="dxa" w:w="1335"/>
             <w:vAlign w:val="center"/>
           </w:tcPr>
           <w:p>
@@ -204,7 +184,7 @@
         </w:tc>
         <w:tc>
           <w:tcPr>
-            <w:tcW w:type="dxa" w:w="1224"/>
+            <w:tcW w:type="dxa" w:w="1335"/>
             <w:vAlign w:val="center"/>
           </w:tcPr>
           <w:p>
@@ -223,7 +203,7 @@
         </w:tc>
         <w:tc>
           <w:tcPr>
-            <w:tcW w:type="dxa" w:w="1224"/>
+            <w:tcW w:type="dxa" w:w="1335"/>
             <w:vAlign w:val="center"/>
           </w:tcPr>
           <w:p>
@@ -242,7 +222,7 @@
         </w:tc>
         <w:tc>
           <w:tcPr>
-            <w:tcW w:type="dxa" w:w="1224"/>
+            <w:tcW w:type="dxa" w:w="1335"/>
             <w:vAlign w:val="center"/>
           </w:tcPr>
           <w:p>
@@ -261,7 +241,7 @@
         </w:tc>
         <w:tc>
           <w:tcPr>
-            <w:tcW w:type="dxa" w:w="1224"/>
+            <w:tcW w:type="dxa" w:w="1335"/>
             <w:vAlign w:val="center"/>
           </w:tcPr>
           <w:p>
@@ -285,7 +265,7 @@
         </w:trPr>
         <w:tc>
           <w:tcPr>
-            <w:tcW w:type="dxa" w:w="1224"/>
+            <w:tcW w:type="dxa" w:w="1335"/>
             <w:vAlign w:val="center"/>
           </w:tcPr>
           <w:p>
@@ -304,7 +284,7 @@
         </w:tc>
         <w:tc>
           <w:tcPr>
-            <w:tcW w:type="dxa" w:w="1224"/>
+            <w:tcW w:type="dxa" w:w="1335"/>
             <w:vAlign w:val="center"/>
           </w:tcPr>
           <w:p>
@@ -323,7 +303,7 @@
         </w:tc>
         <w:tc>
           <w:tcPr>
-            <w:tcW w:type="dxa" w:w="1224"/>
+            <w:tcW w:type="dxa" w:w="1335"/>
             <w:vAlign w:val="center"/>
           </w:tcPr>
           <w:p>
@@ -342,7 +322,7 @@
         </w:tc>
         <w:tc>
           <w:tcPr>
-            <w:tcW w:type="dxa" w:w="1224"/>
+            <w:tcW w:type="dxa" w:w="1335"/>
             <w:vAlign w:val="center"/>
           </w:tcPr>
           <w:p>
@@ -361,7 +341,7 @@
         </w:tc>
         <w:tc>
           <w:tcPr>
-            <w:tcW w:type="dxa" w:w="1224"/>
+            <w:tcW w:type="dxa" w:w="1335"/>
             <w:vAlign w:val="center"/>
           </w:tcPr>
           <w:p>
@@ -380,7 +360,7 @@
         </w:tc>
         <w:tc>
           <w:tcPr>
-            <w:tcW w:type="dxa" w:w="1224"/>
+            <w:tcW w:type="dxa" w:w="1335"/>
             <w:vAlign w:val="center"/>
           </w:tcPr>
           <w:p>
@@ -399,26 +379,7 @@
         </w:tc>
         <w:tc>
           <w:tcPr>
-            <w:tcW w:type="dxa" w:w="1224"/>
-            <w:vAlign w:val="center"/>
-          </w:tcPr>
-          <w:p>
-            <w:pPr>
-              <w:jc w:val="center"/>
-            </w:pPr>
-            <w:r>
-              <w:rPr>
-                <w:b/>
-                <w:color w:val="FFFFFF"/>
-                <w:sz w:val="14"/>
-              </w:rPr>
-              <w:t>Logistic regression</w:t>
-            </w:r>
-          </w:p>
-        </w:tc>
-        <w:tc>
-          <w:tcPr>
-            <w:tcW w:type="dxa" w:w="1224"/>
+            <w:tcW w:type="dxa" w:w="1335"/>
             <w:vAlign w:val="center"/>
           </w:tcPr>
           <w:p>
@@ -437,7 +398,7 @@
         </w:tc>
         <w:tc>
           <w:tcPr>
-            <w:tcW w:type="dxa" w:w="1224"/>
+            <w:tcW w:type="dxa" w:w="1335"/>
             <w:vAlign w:val="center"/>
           </w:tcPr>
           <w:p>
@@ -456,7 +417,7 @@
         </w:tc>
         <w:tc>
           <w:tcPr>
-            <w:tcW w:type="dxa" w:w="1224"/>
+            <w:tcW w:type="dxa" w:w="1335"/>
             <w:vAlign w:val="center"/>
           </w:tcPr>
           <w:p>
@@ -475,7 +436,7 @@
         </w:tc>
         <w:tc>
           <w:tcPr>
-            <w:tcW w:type="dxa" w:w="1224"/>
+            <w:tcW w:type="dxa" w:w="1335"/>
             <w:vAlign w:val="center"/>
           </w:tcPr>
           <w:p>
@@ -494,7 +455,7 @@
         </w:tc>
         <w:tc>
           <w:tcPr>
-            <w:tcW w:type="dxa" w:w="1224"/>
+            <w:tcW w:type="dxa" w:w="1335"/>
             <w:vAlign w:val="center"/>
           </w:tcPr>
           <w:p>
@@ -515,7 +476,7 @@
       <w:tr>
         <w:tc>
           <w:tcPr>
-            <w:tcW w:type="dxa" w:w="1224"/>
+            <w:tcW w:type="dxa" w:w="1335"/>
             <w:vAlign w:val="center"/>
           </w:tcPr>
           <w:p>
@@ -533,7 +494,7 @@
         </w:tc>
         <w:tc>
           <w:tcPr>
-            <w:tcW w:type="dxa" w:w="1224"/>
+            <w:tcW w:type="dxa" w:w="1335"/>
             <w:vAlign w:val="center"/>
           </w:tcPr>
           <w:p>
@@ -551,7 +512,7 @@
         </w:tc>
         <w:tc>
           <w:tcPr>
-            <w:tcW w:type="dxa" w:w="1224"/>
+            <w:tcW w:type="dxa" w:w="1335"/>
             <w:vAlign w:val="center"/>
           </w:tcPr>
           <w:p>
@@ -569,7 +530,7 @@
         </w:tc>
         <w:tc>
           <w:tcPr>
-            <w:tcW w:type="dxa" w:w="1224"/>
+            <w:tcW w:type="dxa" w:w="1335"/>
             <w:vAlign w:val="center"/>
           </w:tcPr>
           <w:p>
@@ -587,7 +548,7 @@
         </w:tc>
         <w:tc>
           <w:tcPr>
-            <w:tcW w:type="dxa" w:w="1224"/>
+            <w:tcW w:type="dxa" w:w="1335"/>
             <w:vAlign w:val="center"/>
           </w:tcPr>
           <w:p>
@@ -605,7 +566,7 @@
         </w:tc>
         <w:tc>
           <w:tcPr>
-            <w:tcW w:type="dxa" w:w="1224"/>
+            <w:tcW w:type="dxa" w:w="1335"/>
             <w:vAlign w:val="center"/>
           </w:tcPr>
           <w:p>
@@ -623,25 +584,7 @@
         </w:tc>
         <w:tc>
           <w:tcPr>
-            <w:tcW w:type="dxa" w:w="1224"/>
-            <w:vAlign w:val="center"/>
-          </w:tcPr>
-          <w:p>
-            <w:pPr>
-              <w:jc w:val="center"/>
-            </w:pPr>
-            <w:r>
-              <w:rPr>
-                <w:b w:val="0"/>
-                <w:sz w:val="14"/>
-              </w:rPr>
-              <w:t>Logistic regression</w:t>
-            </w:r>
-          </w:p>
-        </w:tc>
-        <w:tc>
-          <w:tcPr>
-            <w:tcW w:type="dxa" w:w="1224"/>
+            <w:tcW w:type="dxa" w:w="1335"/>
             <w:vAlign w:val="center"/>
           </w:tcPr>
           <w:p>
@@ -659,7 +602,7 @@
         </w:tc>
         <w:tc>
           <w:tcPr>
-            <w:tcW w:type="dxa" w:w="1224"/>
+            <w:tcW w:type="dxa" w:w="1335"/>
             <w:vAlign w:val="center"/>
           </w:tcPr>
           <w:p>
@@ -677,7 +620,7 @@
         </w:tc>
         <w:tc>
           <w:tcPr>
-            <w:tcW w:type="dxa" w:w="1224"/>
+            <w:tcW w:type="dxa" w:w="1335"/>
             <w:vAlign w:val="center"/>
           </w:tcPr>
           <w:p>
@@ -695,7 +638,7 @@
         </w:tc>
         <w:tc>
           <w:tcPr>
-            <w:tcW w:type="dxa" w:w="1224"/>
+            <w:tcW w:type="dxa" w:w="1335"/>
             <w:vAlign w:val="center"/>
           </w:tcPr>
           <w:p>
@@ -713,7 +656,7 @@
         </w:tc>
         <w:tc>
           <w:tcPr>
-            <w:tcW w:type="dxa" w:w="1224"/>
+            <w:tcW w:type="dxa" w:w="1335"/>
             <w:vAlign w:val="center"/>
           </w:tcPr>
           <w:p>
@@ -736,7 +679,7 @@
         </w:trPr>
         <w:tc>
           <w:tcPr>
-            <w:tcW w:type="dxa" w:w="1224"/>
+            <w:tcW w:type="dxa" w:w="1335"/>
             <w:vAlign w:val="center"/>
           </w:tcPr>
           <w:p>
@@ -754,7 +697,7 @@
         </w:tc>
         <w:tc>
           <w:tcPr>
-            <w:tcW w:type="dxa" w:w="1224"/>
+            <w:tcW w:type="dxa" w:w="1335"/>
             <w:vAlign w:val="center"/>
           </w:tcPr>
           <w:p>
@@ -772,7 +715,7 @@
         </w:tc>
         <w:tc>
           <w:tcPr>
-            <w:tcW w:type="dxa" w:w="1224"/>
+            <w:tcW w:type="dxa" w:w="1335"/>
             <w:vAlign w:val="center"/>
           </w:tcPr>
           <w:p>
@@ -790,7 +733,7 @@
         </w:tc>
         <w:tc>
           <w:tcPr>
-            <w:tcW w:type="dxa" w:w="1224"/>
+            <w:tcW w:type="dxa" w:w="1335"/>
             <w:vAlign w:val="center"/>
           </w:tcPr>
           <w:p>
@@ -808,7 +751,7 @@
         </w:tc>
         <w:tc>
           <w:tcPr>
-            <w:tcW w:type="dxa" w:w="1224"/>
+            <w:tcW w:type="dxa" w:w="1335"/>
             <w:vAlign w:val="center"/>
           </w:tcPr>
           <w:p>
@@ -826,7 +769,7 @@
         </w:tc>
         <w:tc>
           <w:tcPr>
-            <w:tcW w:type="dxa" w:w="1224"/>
+            <w:tcW w:type="dxa" w:w="1335"/>
             <w:vAlign w:val="center"/>
           </w:tcPr>
           <w:p>
@@ -844,25 +787,7 @@
         </w:tc>
         <w:tc>
           <w:tcPr>
-            <w:tcW w:type="dxa" w:w="1224"/>
-            <w:vAlign w:val="center"/>
-          </w:tcPr>
-          <w:p>
-            <w:pPr>
-              <w:jc w:val="center"/>
-            </w:pPr>
-            <w:r>
-              <w:rPr>
-                <w:b w:val="0"/>
-                <w:sz w:val="14"/>
-              </w:rPr>
-              <w:t>Logistic regression</w:t>
-            </w:r>
-          </w:p>
-        </w:tc>
-        <w:tc>
-          <w:tcPr>
-            <w:tcW w:type="dxa" w:w="1224"/>
+            <w:tcW w:type="dxa" w:w="1335"/>
             <w:vAlign w:val="center"/>
           </w:tcPr>
           <w:p>
@@ -880,7 +805,7 @@
         </w:tc>
         <w:tc>
           <w:tcPr>
-            <w:tcW w:type="dxa" w:w="1224"/>
+            <w:tcW w:type="dxa" w:w="1335"/>
             <w:vAlign w:val="center"/>
           </w:tcPr>
           <w:p>
@@ -898,7 +823,7 @@
         </w:tc>
         <w:tc>
           <w:tcPr>
-            <w:tcW w:type="dxa" w:w="1224"/>
+            <w:tcW w:type="dxa" w:w="1335"/>
             <w:vAlign w:val="center"/>
           </w:tcPr>
           <w:p>
@@ -916,7 +841,7 @@
         </w:tc>
         <w:tc>
           <w:tcPr>
-            <w:tcW w:type="dxa" w:w="1224"/>
+            <w:tcW w:type="dxa" w:w="1335"/>
             <w:vAlign w:val="center"/>
           </w:tcPr>
           <w:p>
@@ -934,7 +859,7 @@
         </w:tc>
         <w:tc>
           <w:tcPr>
-            <w:tcW w:type="dxa" w:w="1224"/>
+            <w:tcW w:type="dxa" w:w="1335"/>
             <w:vAlign w:val="center"/>
           </w:tcPr>
           <w:p>
@@ -954,7 +879,7 @@
       <w:tr>
         <w:tc>
           <w:tcPr>
-            <w:tcW w:type="dxa" w:w="1224"/>
+            <w:tcW w:type="dxa" w:w="1335"/>
             <w:vAlign w:val="center"/>
           </w:tcPr>
           <w:p>
@@ -972,7 +897,7 @@
         </w:tc>
         <w:tc>
           <w:tcPr>
-            <w:tcW w:type="dxa" w:w="1224"/>
+            <w:tcW w:type="dxa" w:w="1335"/>
             <w:vAlign w:val="center"/>
           </w:tcPr>
           <w:p>
@@ -990,7 +915,7 @@
         </w:tc>
         <w:tc>
           <w:tcPr>
-            <w:tcW w:type="dxa" w:w="1224"/>
+            <w:tcW w:type="dxa" w:w="1335"/>
             <w:vAlign w:val="center"/>
           </w:tcPr>
           <w:p>
@@ -1008,7 +933,7 @@
         </w:tc>
         <w:tc>
           <w:tcPr>
-            <w:tcW w:type="dxa" w:w="1224"/>
+            <w:tcW w:type="dxa" w:w="1335"/>
             <w:vAlign w:val="center"/>
           </w:tcPr>
           <w:p>
@@ -1026,7 +951,7 @@
         </w:tc>
         <w:tc>
           <w:tcPr>
-            <w:tcW w:type="dxa" w:w="1224"/>
+            <w:tcW w:type="dxa" w:w="1335"/>
             <w:vAlign w:val="center"/>
           </w:tcPr>
           <w:p>
@@ -1044,7 +969,7 @@
         </w:tc>
         <w:tc>
           <w:tcPr>
-            <w:tcW w:type="dxa" w:w="1224"/>
+            <w:tcW w:type="dxa" w:w="1335"/>
             <w:vAlign w:val="center"/>
           </w:tcPr>
           <w:p>
@@ -1062,25 +987,7 @@
         </w:tc>
         <w:tc>
           <w:tcPr>
-            <w:tcW w:type="dxa" w:w="1224"/>
-            <w:vAlign w:val="center"/>
-          </w:tcPr>
-          <w:p>
-            <w:pPr>
-              <w:jc w:val="center"/>
-            </w:pPr>
-            <w:r>
-              <w:rPr>
-                <w:b w:val="0"/>
-                <w:sz w:val="14"/>
-              </w:rPr>
-              <w:t>Logistic regression</w:t>
-            </w:r>
-          </w:p>
-        </w:tc>
-        <w:tc>
-          <w:tcPr>
-            <w:tcW w:type="dxa" w:w="1224"/>
+            <w:tcW w:type="dxa" w:w="1335"/>
             <w:vAlign w:val="center"/>
           </w:tcPr>
           <w:p>
@@ -1098,7 +1005,7 @@
         </w:tc>
         <w:tc>
           <w:tcPr>
-            <w:tcW w:type="dxa" w:w="1224"/>
+            <w:tcW w:type="dxa" w:w="1335"/>
             <w:vAlign w:val="center"/>
           </w:tcPr>
           <w:p>
@@ -1116,7 +1023,7 @@
         </w:tc>
         <w:tc>
           <w:tcPr>
-            <w:tcW w:type="dxa" w:w="1224"/>
+            <w:tcW w:type="dxa" w:w="1335"/>
             <w:vAlign w:val="center"/>
           </w:tcPr>
           <w:p>
@@ -1134,7 +1041,7 @@
         </w:tc>
         <w:tc>
           <w:tcPr>
-            <w:tcW w:type="dxa" w:w="1224"/>
+            <w:tcW w:type="dxa" w:w="1335"/>
             <w:vAlign w:val="center"/>
           </w:tcPr>
           <w:p>
@@ -1152,7 +1059,7 @@
         </w:tc>
         <w:tc>
           <w:tcPr>
-            <w:tcW w:type="dxa" w:w="1224"/>
+            <w:tcW w:type="dxa" w:w="1335"/>
             <w:vAlign w:val="center"/>
           </w:tcPr>
           <w:p>
@@ -1175,7 +1082,7 @@
         </w:trPr>
         <w:tc>
           <w:tcPr>
-            <w:tcW w:type="dxa" w:w="1224"/>
+            <w:tcW w:type="dxa" w:w="1335"/>
             <w:vAlign w:val="center"/>
           </w:tcPr>
           <w:p>
@@ -1193,7 +1100,7 @@
         </w:tc>
         <w:tc>
           <w:tcPr>
-            <w:tcW w:type="dxa" w:w="1224"/>
+            <w:tcW w:type="dxa" w:w="1335"/>
             <w:vAlign w:val="center"/>
           </w:tcPr>
           <w:p>
@@ -1211,7 +1118,7 @@
         </w:tc>
         <w:tc>
           <w:tcPr>
-            <w:tcW w:type="dxa" w:w="1224"/>
+            <w:tcW w:type="dxa" w:w="1335"/>
             <w:vAlign w:val="center"/>
           </w:tcPr>
           <w:p>
@@ -1229,7 +1136,7 @@
         </w:tc>
         <w:tc>
           <w:tcPr>
-            <w:tcW w:type="dxa" w:w="1224"/>
+            <w:tcW w:type="dxa" w:w="1335"/>
             <w:vAlign w:val="center"/>
           </w:tcPr>
           <w:p>
@@ -1247,7 +1154,7 @@
         </w:tc>
         <w:tc>
           <w:tcPr>
-            <w:tcW w:type="dxa" w:w="1224"/>
+            <w:tcW w:type="dxa" w:w="1335"/>
             <w:vAlign w:val="center"/>
           </w:tcPr>
           <w:p>
@@ -1265,7 +1172,7 @@
         </w:tc>
         <w:tc>
           <w:tcPr>
-            <w:tcW w:type="dxa" w:w="1224"/>
+            <w:tcW w:type="dxa" w:w="1335"/>
             <w:vAlign w:val="center"/>
           </w:tcPr>
           <w:p>
@@ -1283,25 +1190,7 @@
         </w:tc>
         <w:tc>
           <w:tcPr>
-            <w:tcW w:type="dxa" w:w="1224"/>
-            <w:vAlign w:val="center"/>
-          </w:tcPr>
-          <w:p>
-            <w:pPr>
-              <w:jc w:val="center"/>
-            </w:pPr>
-            <w:r>
-              <w:rPr>
-                <w:b w:val="0"/>
-                <w:sz w:val="14"/>
-              </w:rPr>
-              <w:t>Logistic regression</w:t>
-            </w:r>
-          </w:p>
-        </w:tc>
-        <w:tc>
-          <w:tcPr>
-            <w:tcW w:type="dxa" w:w="1224"/>
+            <w:tcW w:type="dxa" w:w="1335"/>
             <w:vAlign w:val="center"/>
           </w:tcPr>
           <w:p>
@@ -1319,7 +1208,7 @@
         </w:tc>
         <w:tc>
           <w:tcPr>
-            <w:tcW w:type="dxa" w:w="1224"/>
+            <w:tcW w:type="dxa" w:w="1335"/>
             <w:vAlign w:val="center"/>
           </w:tcPr>
           <w:p>
@@ -1337,7 +1226,7 @@
         </w:tc>
         <w:tc>
           <w:tcPr>
-            <w:tcW w:type="dxa" w:w="1224"/>
+            <w:tcW w:type="dxa" w:w="1335"/>
             <w:vAlign w:val="center"/>
           </w:tcPr>
           <w:p>
@@ -1355,7 +1244,7 @@
         </w:tc>
         <w:tc>
           <w:tcPr>
-            <w:tcW w:type="dxa" w:w="1224"/>
+            <w:tcW w:type="dxa" w:w="1335"/>
             <w:vAlign w:val="center"/>
           </w:tcPr>
           <w:p>
@@ -1373,7 +1262,7 @@
         </w:tc>
         <w:tc>
           <w:tcPr>
-            <w:tcW w:type="dxa" w:w="1224"/>
+            <w:tcW w:type="dxa" w:w="1335"/>
             <w:vAlign w:val="center"/>
           </w:tcPr>
           <w:p>
@@ -1393,7 +1282,7 @@
       <w:tr>
         <w:tc>
           <w:tcPr>
-            <w:tcW w:type="dxa" w:w="1224"/>
+            <w:tcW w:type="dxa" w:w="1335"/>
             <w:vAlign w:val="center"/>
           </w:tcPr>
           <w:p>
@@ -1411,7 +1300,7 @@
         </w:tc>
         <w:tc>
           <w:tcPr>
-            <w:tcW w:type="dxa" w:w="1224"/>
+            <w:tcW w:type="dxa" w:w="1335"/>
             <w:vAlign w:val="center"/>
           </w:tcPr>
           <w:p>
@@ -1429,7 +1318,7 @@
         </w:tc>
         <w:tc>
           <w:tcPr>
-            <w:tcW w:type="dxa" w:w="1224"/>
+            <w:tcW w:type="dxa" w:w="1335"/>
             <w:vAlign w:val="center"/>
           </w:tcPr>
           <w:p>
@@ -1447,7 +1336,7 @@
         </w:tc>
         <w:tc>
           <w:tcPr>
-            <w:tcW w:type="dxa" w:w="1224"/>
+            <w:tcW w:type="dxa" w:w="1335"/>
             <w:vAlign w:val="center"/>
           </w:tcPr>
           <w:p>
@@ -1465,7 +1354,7 @@
         </w:tc>
         <w:tc>
           <w:tcPr>
-            <w:tcW w:type="dxa" w:w="1224"/>
+            <w:tcW w:type="dxa" w:w="1335"/>
             <w:vAlign w:val="center"/>
           </w:tcPr>
           <w:p>
@@ -1483,7 +1372,7 @@
         </w:tc>
         <w:tc>
           <w:tcPr>
-            <w:tcW w:type="dxa" w:w="1224"/>
+            <w:tcW w:type="dxa" w:w="1335"/>
             <w:vAlign w:val="center"/>
           </w:tcPr>
           <w:p>
@@ -1501,25 +1390,7 @@
         </w:tc>
         <w:tc>
           <w:tcPr>
-            <w:tcW w:type="dxa" w:w="1224"/>
-            <w:vAlign w:val="center"/>
-          </w:tcPr>
-          <w:p>
-            <w:pPr>
-              <w:jc w:val="center"/>
-            </w:pPr>
-            <w:r>
-              <w:rPr>
-                <w:b w:val="0"/>
-                <w:sz w:val="14"/>
-              </w:rPr>
-              <w:t>Logistic regression</w:t>
-            </w:r>
-          </w:p>
-        </w:tc>
-        <w:tc>
-          <w:tcPr>
-            <w:tcW w:type="dxa" w:w="1224"/>
+            <w:tcW w:type="dxa" w:w="1335"/>
             <w:vAlign w:val="center"/>
           </w:tcPr>
           <w:p>
@@ -1537,7 +1408,7 @@
         </w:tc>
         <w:tc>
           <w:tcPr>
-            <w:tcW w:type="dxa" w:w="1224"/>
+            <w:tcW w:type="dxa" w:w="1335"/>
             <w:vAlign w:val="center"/>
           </w:tcPr>
           <w:p>
@@ -1555,7 +1426,7 @@
         </w:tc>
         <w:tc>
           <w:tcPr>
-            <w:tcW w:type="dxa" w:w="1224"/>
+            <w:tcW w:type="dxa" w:w="1335"/>
             <w:vAlign w:val="center"/>
           </w:tcPr>
           <w:p>
@@ -1573,7 +1444,7 @@
         </w:tc>
         <w:tc>
           <w:tcPr>
-            <w:tcW w:type="dxa" w:w="1224"/>
+            <w:tcW w:type="dxa" w:w="1335"/>
             <w:vAlign w:val="center"/>
           </w:tcPr>
           <w:p>
@@ -1591,7 +1462,7 @@
         </w:tc>
         <w:tc>
           <w:tcPr>
-            <w:tcW w:type="dxa" w:w="1224"/>
+            <w:tcW w:type="dxa" w:w="1335"/>
             <w:vAlign w:val="center"/>
           </w:tcPr>
           <w:p>
@@ -1614,7 +1485,7 @@
         </w:trPr>
         <w:tc>
           <w:tcPr>
-            <w:tcW w:type="dxa" w:w="1224"/>
+            <w:tcW w:type="dxa" w:w="1335"/>
             <w:vAlign w:val="center"/>
           </w:tcPr>
           <w:p>
@@ -1632,7 +1503,7 @@
         </w:tc>
         <w:tc>
           <w:tcPr>
-            <w:tcW w:type="dxa" w:w="1224"/>
+            <w:tcW w:type="dxa" w:w="1335"/>
             <w:vAlign w:val="center"/>
           </w:tcPr>
           <w:p>
@@ -1650,7 +1521,7 @@
         </w:tc>
         <w:tc>
           <w:tcPr>
-            <w:tcW w:type="dxa" w:w="1224"/>
+            <w:tcW w:type="dxa" w:w="1335"/>
             <w:vAlign w:val="center"/>
           </w:tcPr>
           <w:p>
@@ -1668,7 +1539,7 @@
         </w:tc>
         <w:tc>
           <w:tcPr>
-            <w:tcW w:type="dxa" w:w="1224"/>
+            <w:tcW w:type="dxa" w:w="1335"/>
             <w:vAlign w:val="center"/>
           </w:tcPr>
           <w:p>
@@ -1686,7 +1557,7 @@
         </w:tc>
         <w:tc>
           <w:tcPr>
-            <w:tcW w:type="dxa" w:w="1224"/>
+            <w:tcW w:type="dxa" w:w="1335"/>
             <w:vAlign w:val="center"/>
           </w:tcPr>
           <w:p>
@@ -1704,7 +1575,7 @@
         </w:tc>
         <w:tc>
           <w:tcPr>
-            <w:tcW w:type="dxa" w:w="1224"/>
+            <w:tcW w:type="dxa" w:w="1335"/>
             <w:vAlign w:val="center"/>
           </w:tcPr>
           <w:p>
@@ -1722,7 +1593,7 @@
         </w:tc>
         <w:tc>
           <w:tcPr>
-            <w:tcW w:type="dxa" w:w="1224"/>
+            <w:tcW w:type="dxa" w:w="1335"/>
             <w:vAlign w:val="center"/>
           </w:tcPr>
           <w:p>
@@ -1734,13 +1605,13 @@
                 <w:b w:val="0"/>
                 <w:sz w:val="14"/>
               </w:rPr>
-              <w:t>Random forest</w:t>
+              <w:t>0.598 [0.426, 0.863]</w:t>
             </w:r>
           </w:p>
         </w:tc>
         <w:tc>
           <w:tcPr>
-            <w:tcW w:type="dxa" w:w="1224"/>
+            <w:tcW w:type="dxa" w:w="1335"/>
             <w:vAlign w:val="center"/>
           </w:tcPr>
           <w:p>
@@ -1752,13 +1623,13 @@
                 <w:b w:val="0"/>
                 <w:sz w:val="14"/>
               </w:rPr>
-              <w:t>0.753 [0.520, 0.820]</w:t>
+              <w:t>0.748 [0.593, 0.818]</w:t>
             </w:r>
           </w:p>
         </w:tc>
         <w:tc>
           <w:tcPr>
-            <w:tcW w:type="dxa" w:w="1224"/>
+            <w:tcW w:type="dxa" w:w="1335"/>
             <w:vAlign w:val="center"/>
           </w:tcPr>
           <w:p>
@@ -1770,13 +1641,13 @@
                 <w:b w:val="0"/>
                 <w:sz w:val="14"/>
               </w:rPr>
-              <w:t>0.743 [0.659, 0.881]</w:t>
+              <w:t>0.817 [0.733, 0.944]</w:t>
             </w:r>
           </w:p>
         </w:tc>
         <w:tc>
           <w:tcPr>
-            <w:tcW w:type="dxa" w:w="1224"/>
+            <w:tcW w:type="dxa" w:w="1335"/>
             <w:vAlign w:val="center"/>
           </w:tcPr>
           <w:p>
@@ -1788,13 +1659,13 @@
                 <w:b w:val="0"/>
                 <w:sz w:val="14"/>
               </w:rPr>
-              <w:t>0.860 [0.726, 0.960]</w:t>
+              <w:t>0.783 [0.748, 0.827]</w:t>
             </w:r>
           </w:p>
         </w:tc>
         <w:tc>
           <w:tcPr>
-            <w:tcW w:type="dxa" w:w="1224"/>
+            <w:tcW w:type="dxa" w:w="1335"/>
             <w:vAlign w:val="center"/>
           </w:tcPr>
           <w:p>
@@ -1806,25 +1677,7 @@
                 <w:b w:val="0"/>
                 <w:sz w:val="14"/>
               </w:rPr>
-              <w:t>0.801 [0.774, 0.847]</w:t>
-            </w:r>
-          </w:p>
-        </w:tc>
-        <w:tc>
-          <w:tcPr>
-            <w:tcW w:type="dxa" w:w="1224"/>
-            <w:vAlign w:val="center"/>
-          </w:tcPr>
-          <w:p>
-            <w:pPr>
-              <w:jc w:val="center"/>
-            </w:pPr>
-            <w:r>
-              <w:rPr>
-                <w:b w:val="0"/>
-                <w:sz w:val="14"/>
-              </w:rPr>
-              <w:t>0.760 [0.695, 0.861]</w:t>
+              <w:t>0.758 [0.643, 0.812]</w:t>
             </w:r>
           </w:p>
         </w:tc>
@@ -1832,7 +1685,7 @@
       <w:tr>
         <w:tc>
           <w:tcPr>
-            <w:tcW w:type="dxa" w:w="1224"/>
+            <w:tcW w:type="dxa" w:w="1335"/>
             <w:vAlign w:val="center"/>
           </w:tcPr>
           <w:p>
@@ -1850,7 +1703,7 @@
         </w:tc>
         <w:tc>
           <w:tcPr>
-            <w:tcW w:type="dxa" w:w="1224"/>
+            <w:tcW w:type="dxa" w:w="1335"/>
             <w:vAlign w:val="center"/>
           </w:tcPr>
           <w:p>
@@ -1868,7 +1721,7 @@
         </w:tc>
         <w:tc>
           <w:tcPr>
-            <w:tcW w:type="dxa" w:w="1224"/>
+            <w:tcW w:type="dxa" w:w="1335"/>
             <w:vAlign w:val="center"/>
           </w:tcPr>
           <w:p>
@@ -1886,7 +1739,7 @@
         </w:tc>
         <w:tc>
           <w:tcPr>
-            <w:tcW w:type="dxa" w:w="1224"/>
+            <w:tcW w:type="dxa" w:w="1335"/>
             <w:vAlign w:val="center"/>
           </w:tcPr>
           <w:p>
@@ -1904,7 +1757,7 @@
         </w:tc>
         <w:tc>
           <w:tcPr>
-            <w:tcW w:type="dxa" w:w="1224"/>
+            <w:tcW w:type="dxa" w:w="1335"/>
             <w:vAlign w:val="center"/>
           </w:tcPr>
           <w:p>
@@ -1922,7 +1775,7 @@
         </w:tc>
         <w:tc>
           <w:tcPr>
-            <w:tcW w:type="dxa" w:w="1224"/>
+            <w:tcW w:type="dxa" w:w="1335"/>
             <w:vAlign w:val="center"/>
           </w:tcPr>
           <w:p>
@@ -1940,7 +1793,7 @@
         </w:tc>
         <w:tc>
           <w:tcPr>
-            <w:tcW w:type="dxa" w:w="1224"/>
+            <w:tcW w:type="dxa" w:w="1335"/>
             <w:vAlign w:val="center"/>
           </w:tcPr>
           <w:p>
@@ -1952,13 +1805,13 @@
                 <w:b w:val="0"/>
                 <w:sz w:val="14"/>
               </w:rPr>
-              <w:t>Random forest</w:t>
+              <w:t>0.695 [0.667, 0.929]</w:t>
             </w:r>
           </w:p>
         </w:tc>
         <w:tc>
           <w:tcPr>
-            <w:tcW w:type="dxa" w:w="1224"/>
+            <w:tcW w:type="dxa" w:w="1335"/>
             <w:vAlign w:val="center"/>
           </w:tcPr>
           <w:p>
@@ -1970,13 +1823,13 @@
                 <w:b w:val="0"/>
                 <w:sz w:val="14"/>
               </w:rPr>
-              <w:t>0.733 [0.643, 0.787]</w:t>
+              <w:t>0.720 [0.561, 0.769]</w:t>
             </w:r>
           </w:p>
         </w:tc>
         <w:tc>
           <w:tcPr>
-            <w:tcW w:type="dxa" w:w="1224"/>
+            <w:tcW w:type="dxa" w:w="1335"/>
             <w:vAlign w:val="center"/>
           </w:tcPr>
           <w:p>
@@ -1988,13 +1841,13 @@
                 <w:b w:val="0"/>
                 <w:sz w:val="14"/>
               </w:rPr>
-              <w:t>0.759 [0.693, 0.829]</w:t>
+              <w:t>0.763 [0.685, 0.921]</w:t>
             </w:r>
           </w:p>
         </w:tc>
         <w:tc>
           <w:tcPr>
-            <w:tcW w:type="dxa" w:w="1224"/>
+            <w:tcW w:type="dxa" w:w="1335"/>
             <w:vAlign w:val="center"/>
           </w:tcPr>
           <w:p>
@@ -2006,13 +1859,13 @@
                 <w:b w:val="0"/>
                 <w:sz w:val="14"/>
               </w:rPr>
-              <w:t>0.871 [0.793, 0.948]</w:t>
+              <w:t>0.742 [0.705, 0.788]</w:t>
             </w:r>
           </w:p>
         </w:tc>
         <w:tc>
           <w:tcPr>
-            <w:tcW w:type="dxa" w:w="1224"/>
+            <w:tcW w:type="dxa" w:w="1335"/>
             <w:vAlign w:val="center"/>
           </w:tcPr>
           <w:p>
@@ -2024,25 +1877,7 @@
                 <w:b w:val="0"/>
                 <w:sz w:val="14"/>
               </w:rPr>
-              <w:t>0.815 [0.783, 0.857]</w:t>
-            </w:r>
-          </w:p>
-        </w:tc>
-        <w:tc>
-          <w:tcPr>
-            <w:tcW w:type="dxa" w:w="1224"/>
-            <w:vAlign w:val="center"/>
-          </w:tcPr>
-          <w:p>
-            <w:pPr>
-              <w:jc w:val="center"/>
-            </w:pPr>
-            <w:r>
-              <w:rPr>
-                <w:b w:val="0"/>
-                <w:sz w:val="14"/>
-              </w:rPr>
-              <w:t>0.776 [0.725, 0.833]</w:t>
+              <w:t>0.727 [0.610, 0.773]</w:t>
             </w:r>
           </w:p>
         </w:tc>
@@ -2053,7 +1888,7 @@
         </w:trPr>
         <w:tc>
           <w:tcPr>
-            <w:tcW w:type="dxa" w:w="1224"/>
+            <w:tcW w:type="dxa" w:w="1335"/>
             <w:vAlign w:val="center"/>
           </w:tcPr>
           <w:p>
@@ -2071,7 +1906,7 @@
         </w:tc>
         <w:tc>
           <w:tcPr>
-            <w:tcW w:type="dxa" w:w="1224"/>
+            <w:tcW w:type="dxa" w:w="1335"/>
             <w:vAlign w:val="center"/>
           </w:tcPr>
           <w:p>
@@ -2089,7 +1924,7 @@
         </w:tc>
         <w:tc>
           <w:tcPr>
-            <w:tcW w:type="dxa" w:w="1224"/>
+            <w:tcW w:type="dxa" w:w="1335"/>
             <w:vAlign w:val="center"/>
           </w:tcPr>
           <w:p>
@@ -2107,7 +1942,7 @@
         </w:tc>
         <w:tc>
           <w:tcPr>
-            <w:tcW w:type="dxa" w:w="1224"/>
+            <w:tcW w:type="dxa" w:w="1335"/>
             <w:vAlign w:val="center"/>
           </w:tcPr>
           <w:p>
@@ -2125,7 +1960,7 @@
         </w:tc>
         <w:tc>
           <w:tcPr>
-            <w:tcW w:type="dxa" w:w="1224"/>
+            <w:tcW w:type="dxa" w:w="1335"/>
             <w:vAlign w:val="center"/>
           </w:tcPr>
           <w:p>
@@ -2143,7 +1978,7 @@
         </w:tc>
         <w:tc>
           <w:tcPr>
-            <w:tcW w:type="dxa" w:w="1224"/>
+            <w:tcW w:type="dxa" w:w="1335"/>
             <w:vAlign w:val="center"/>
           </w:tcPr>
           <w:p>
@@ -2161,25 +1996,7 @@
         </w:tc>
         <w:tc>
           <w:tcPr>
-            <w:tcW w:type="dxa" w:w="1224"/>
-            <w:vAlign w:val="center"/>
-          </w:tcPr>
-          <w:p>
-            <w:pPr>
-              <w:jc w:val="center"/>
-            </w:pPr>
-            <w:r>
-              <w:rPr>
-                <w:b w:val="0"/>
-                <w:sz w:val="14"/>
-              </w:rPr>
-              <w:t>Logistic regression</w:t>
-            </w:r>
-          </w:p>
-        </w:tc>
-        <w:tc>
-          <w:tcPr>
-            <w:tcW w:type="dxa" w:w="1224"/>
+            <w:tcW w:type="dxa" w:w="1335"/>
             <w:vAlign w:val="center"/>
           </w:tcPr>
           <w:p>
@@ -2197,7 +2014,7 @@
         </w:tc>
         <w:tc>
           <w:tcPr>
-            <w:tcW w:type="dxa" w:w="1224"/>
+            <w:tcW w:type="dxa" w:w="1335"/>
             <w:vAlign w:val="center"/>
           </w:tcPr>
           <w:p>
@@ -2215,7 +2032,7 @@
         </w:tc>
         <w:tc>
           <w:tcPr>
-            <w:tcW w:type="dxa" w:w="1224"/>
+            <w:tcW w:type="dxa" w:w="1335"/>
             <w:vAlign w:val="center"/>
           </w:tcPr>
           <w:p>
@@ -2233,7 +2050,7 @@
         </w:tc>
         <w:tc>
           <w:tcPr>
-            <w:tcW w:type="dxa" w:w="1224"/>
+            <w:tcW w:type="dxa" w:w="1335"/>
             <w:vAlign w:val="center"/>
           </w:tcPr>
           <w:p>
@@ -2251,7 +2068,7 @@
         </w:tc>
         <w:tc>
           <w:tcPr>
-            <w:tcW w:type="dxa" w:w="1224"/>
+            <w:tcW w:type="dxa" w:w="1335"/>
             <w:vAlign w:val="center"/>
           </w:tcPr>
           <w:p>
@@ -2271,7 +2088,7 @@
       <w:tr>
         <w:tc>
           <w:tcPr>
-            <w:tcW w:type="dxa" w:w="1224"/>
+            <w:tcW w:type="dxa" w:w="1335"/>
             <w:vAlign w:val="center"/>
           </w:tcPr>
           <w:p>
@@ -2289,7 +2106,7 @@
         </w:tc>
         <w:tc>
           <w:tcPr>
-            <w:tcW w:type="dxa" w:w="1224"/>
+            <w:tcW w:type="dxa" w:w="1335"/>
             <w:vAlign w:val="center"/>
           </w:tcPr>
           <w:p>
@@ -2307,7 +2124,7 @@
         </w:tc>
         <w:tc>
           <w:tcPr>
-            <w:tcW w:type="dxa" w:w="1224"/>
+            <w:tcW w:type="dxa" w:w="1335"/>
             <w:vAlign w:val="center"/>
           </w:tcPr>
           <w:p>
@@ -2325,7 +2142,7 @@
         </w:tc>
         <w:tc>
           <w:tcPr>
-            <w:tcW w:type="dxa" w:w="1224"/>
+            <w:tcW w:type="dxa" w:w="1335"/>
             <w:vAlign w:val="center"/>
           </w:tcPr>
           <w:p>
@@ -2343,7 +2160,7 @@
         </w:tc>
         <w:tc>
           <w:tcPr>
-            <w:tcW w:type="dxa" w:w="1224"/>
+            <w:tcW w:type="dxa" w:w="1335"/>
             <w:vAlign w:val="center"/>
           </w:tcPr>
           <w:p>
@@ -2361,7 +2178,7 @@
         </w:tc>
         <w:tc>
           <w:tcPr>
-            <w:tcW w:type="dxa" w:w="1224"/>
+            <w:tcW w:type="dxa" w:w="1335"/>
             <w:vAlign w:val="center"/>
           </w:tcPr>
           <w:p>
@@ -2379,25 +2196,7 @@
         </w:tc>
         <w:tc>
           <w:tcPr>
-            <w:tcW w:type="dxa" w:w="1224"/>
-            <w:vAlign w:val="center"/>
-          </w:tcPr>
-          <w:p>
-            <w:pPr>
-              <w:jc w:val="center"/>
-            </w:pPr>
-            <w:r>
-              <w:rPr>
-                <w:b w:val="0"/>
-                <w:sz w:val="14"/>
-              </w:rPr>
-              <w:t>Logistic regression</w:t>
-            </w:r>
-          </w:p>
-        </w:tc>
-        <w:tc>
-          <w:tcPr>
-            <w:tcW w:type="dxa" w:w="1224"/>
+            <w:tcW w:type="dxa" w:w="1335"/>
             <w:vAlign w:val="center"/>
           </w:tcPr>
           <w:p>
@@ -2415,7 +2214,7 @@
         </w:tc>
         <w:tc>
           <w:tcPr>
-            <w:tcW w:type="dxa" w:w="1224"/>
+            <w:tcW w:type="dxa" w:w="1335"/>
             <w:vAlign w:val="center"/>
           </w:tcPr>
           <w:p>
@@ -2433,7 +2232,7 @@
         </w:tc>
         <w:tc>
           <w:tcPr>
-            <w:tcW w:type="dxa" w:w="1224"/>
+            <w:tcW w:type="dxa" w:w="1335"/>
             <w:vAlign w:val="center"/>
           </w:tcPr>
           <w:p>
@@ -2451,7 +2250,7 @@
         </w:tc>
         <w:tc>
           <w:tcPr>
-            <w:tcW w:type="dxa" w:w="1224"/>
+            <w:tcW w:type="dxa" w:w="1335"/>
             <w:vAlign w:val="center"/>
           </w:tcPr>
           <w:p>
@@ -2469,7 +2268,7 @@
         </w:tc>
         <w:tc>
           <w:tcPr>
-            <w:tcW w:type="dxa" w:w="1224"/>
+            <w:tcW w:type="dxa" w:w="1335"/>
             <w:vAlign w:val="center"/>
           </w:tcPr>
           <w:p>

</xml_diff>